<commit_message>
unity project and gdd alt
</commit_message>
<xml_diff>
--- a/8-slices-of-pie-GDD_1.docx
+++ b/8-slices-of-pie-GDD_1.docx
@@ -1340,7 +1340,56 @@
                 <w:sz w:val="15"/>
                 <w:szCs w:val="15"/>
               </w:rPr>
-              <w:t>6 botões: W A S D · E · F</w:t>
+              <w:t>8</w:t>
+            </w:r>
+            <w:r>
+              <w:rPr>
+                <w:sz w:val="15"/>
+                <w:szCs w:val="15"/>
+              </w:rPr>
+              <w:t xml:space="preserve"> botões: W A S D · E · F</w:t>
+            </w:r>
+            <w:r>
+              <w:rPr>
+                <w:sz w:val="15"/>
+                <w:szCs w:val="15"/>
+              </w:rPr>
+              <w:t xml:space="preserve"> </w:t>
+            </w:r>
+            <w:r>
+              <w:rPr>
+                <w:sz w:val="15"/>
+                <w:szCs w:val="15"/>
+              </w:rPr>
+              <w:t>·</w:t>
+            </w:r>
+            <w:r>
+              <w:rPr>
+                <w:sz w:val="15"/>
+                <w:szCs w:val="15"/>
+              </w:rPr>
+              <w:t xml:space="preserve"> CTRL </w:t>
+            </w:r>
+            <w:r>
+              <w:rPr>
+                <w:sz w:val="15"/>
+                <w:szCs w:val="15"/>
+              </w:rPr>
+              <w:t>·</w:t>
+            </w:r>
+            <w:r>
+              <w:rPr>
+                <w:sz w:val="15"/>
+                <w:szCs w:val="15"/>
+              </w:rPr>
+              <w:t xml:space="preserve"> </w:t>
+            </w:r>
+            <w:r>
+              <w:rPr>
+                <w:sz w:val="15"/>
+                <w:szCs w:val="15"/>
+              </w:rPr>
+              <w:t>ESC</w:t>
             </w:r>
           </w:p>
         </w:tc>
@@ -3223,8 +3272,8 @@
           <w:noProof/>
         </w:rPr>
         <w:drawing>
-          <wp:inline distT="0" distB="0" distL="0" distR="0" wp14:anchorId="155A432F" wp14:editId="42D02822">
-            <wp:extent cx="4095750" cy="2305050"/>
+          <wp:inline distT="0" distB="0" distL="0" distR="0" wp14:anchorId="155A432F" wp14:editId="2C980B18">
+            <wp:extent cx="2541366" cy="2305050"/>
             <wp:effectExtent l="0" t="0" r="0" b="0"/>
             <wp:docPr id="573315754" name="Imagem 573315754"/>
             <wp:cNvGraphicFramePr>
@@ -3234,14 +3283,19 @@
               <a:graphicData uri="http://schemas.openxmlformats.org/drawingml/2006/picture">
                 <pic:pic xmlns:pic="http://schemas.openxmlformats.org/drawingml/2006/picture">
                   <pic:nvPicPr>
-                    <pic:cNvPr id="0" name=""/>
+                    <pic:cNvPr id="573315754" name="Imagem 573315754"/>
                     <pic:cNvPicPr>
                       <a:picLocks noChangeAspect="1" noChangeArrowheads="1"/>
                     </pic:cNvPicPr>
                   </pic:nvPicPr>
                   <pic:blipFill>
-                    <a:blip r:embed="rId8"/>
-                    <a:srcRect/>
+                    <a:blip r:embed="rId8" cstate="print">
+                      <a:extLst>
+                        <a:ext uri="{28A0092B-C50C-407E-A947-70E740481C1C}">
+                          <a14:useLocalDpi xmlns:a14="http://schemas.microsoft.com/office/drawing/2010/main" val="0"/>
+                        </a:ext>
+                      </a:extLst>
+                    </a:blip>
                     <a:stretch>
                       <a:fillRect/>
                     </a:stretch>
@@ -3249,7 +3303,7 @@
                   <pic:spPr bwMode="auto">
                     <a:xfrm>
                       <a:off x="0" y="0"/>
-                      <a:ext cx="4095750" cy="2305050"/>
+                      <a:ext cx="2541366" cy="2305050"/>
                     </a:xfrm>
                     <a:prstGeom prst="rect">
                       <a:avLst/>
@@ -3275,7 +3329,87 @@
           <w:sz w:val="14"/>
           <w:szCs w:val="14"/>
         </w:rPr>
-        <w:t>Mock da HUD e do raio de luz do lampião (1 = 3 corações · 2 = bateria · 3 = relógio).</w:t>
+        <w:t>Mock d</w:t>
+      </w:r>
+      <w:r>
+        <w:rPr>
+          <w:i/>
+          <w:iCs/>
+          <w:color w:val="6E6A76"/>
+          <w:sz w:val="14"/>
+          <w:szCs w:val="14"/>
+        </w:rPr>
+        <w:t>o Menu</w:t>
+      </w:r>
+      <w:r>
+        <w:rPr>
+          <w:i/>
+          <w:iCs/>
+          <w:color w:val="6E6A76"/>
+          <w:sz w:val="14"/>
+          <w:szCs w:val="14"/>
+        </w:rPr>
+        <w:t xml:space="preserve"> e do raio de luz do lampião (</w:t>
+      </w:r>
+      <w:r>
+        <w:rPr>
+          <w:i/>
+          <w:iCs/>
+          <w:color w:val="6E6A76"/>
+          <w:sz w:val="14"/>
+          <w:szCs w:val="14"/>
+        </w:rPr>
+        <w:t>2</w:t>
+      </w:r>
+      <w:r>
+        <w:rPr>
+          <w:i/>
+          <w:iCs/>
+          <w:color w:val="6E6A76"/>
+          <w:sz w:val="14"/>
+          <w:szCs w:val="14"/>
+        </w:rPr>
+        <w:t xml:space="preserve"> = 3 corações · </w:t>
+      </w:r>
+      <w:r>
+        <w:rPr>
+          <w:i/>
+          <w:iCs/>
+          <w:color w:val="6E6A76"/>
+          <w:sz w:val="14"/>
+          <w:szCs w:val="14"/>
+        </w:rPr>
+        <w:t>3</w:t>
+      </w:r>
+      <w:r>
+        <w:rPr>
+          <w:i/>
+          <w:iCs/>
+          <w:color w:val="6E6A76"/>
+          <w:sz w:val="14"/>
+          <w:szCs w:val="14"/>
+        </w:rPr>
+        <w:t xml:space="preserve"> = bateria ·</w:t>
+      </w:r>
+      <w:r>
+        <w:rPr>
+          <w:i/>
+          <w:iCs/>
+          <w:color w:val="6E6A76"/>
+          <w:sz w:val="14"/>
+          <w:szCs w:val="14"/>
+        </w:rPr>
+        <w:t xml:space="preserve"> 1</w:t>
+      </w:r>
+      <w:r>
+        <w:rPr>
+          <w:i/>
+          <w:iCs/>
+          <w:color w:val="6E6A76"/>
+          <w:sz w:val="14"/>
+          <w:szCs w:val="14"/>
+        </w:rPr>
+        <w:t xml:space="preserve">  = relógio).</w:t>
       </w:r>
     </w:p>
     <w:tbl>
@@ -3329,26 +3463,8 @@
                 <w:sz w:val="14"/>
                 <w:szCs w:val="14"/>
               </w:rPr>
-              <w:t>ELEMENTO DA HUD</w:t>
-            </w:r>
-          </w:p>
-        </w:tc>
-        <w:tc>
-          <w:tcPr>
-            <w:tcW w:w="2100" w:type="dxa"/>
-            <w:shd w:val="clear" w:color="auto" w:fill="1B1620"/>
-            <w:tcMar>
-              <w:top w:w="40" w:type="dxa"/>
-              <w:left w:w="90" w:type="dxa"/>
-              <w:bottom w:w="40" w:type="dxa"/>
-              <w:right w:w="90" w:type="dxa"/>
-            </w:tcMar>
-            <w:vAlign w:val="center"/>
-          </w:tcPr>
-          <w:p>
-            <w:pPr>
-              <w:spacing w:before="28" w:after="28" w:line="215" w:lineRule="auto"/>
-            </w:pPr>
+              <w:t>ELEMENTO D</w:t>
+            </w:r>
             <w:r>
               <w:rPr>
                 <w:rFonts w:ascii="Consolas" w:eastAsia="Consolas" w:hAnsi="Consolas" w:cs="Consolas"/>
@@ -3358,13 +3474,13 @@
                 <w:sz w:val="14"/>
                 <w:szCs w:val="14"/>
               </w:rPr>
-              <w:t>POSIÇÃO</w:t>
-            </w:r>
-          </w:p>
-        </w:tc>
-        <w:tc>
-          <w:tcPr>
-            <w:tcW w:w="5506" w:type="dxa"/>
+              <w:t>O MENU</w:t>
+            </w:r>
+          </w:p>
+        </w:tc>
+        <w:tc>
+          <w:tcPr>
+            <w:tcW w:w="2100" w:type="dxa"/>
             <w:shd w:val="clear" w:color="auto" w:fill="1B1620"/>
             <w:tcMar>
               <w:top w:w="40" w:type="dxa"/>
@@ -3387,6 +3503,35 @@
                 <w:sz w:val="14"/>
                 <w:szCs w:val="14"/>
               </w:rPr>
+              <w:t>POSIÇÃO</w:t>
+            </w:r>
+          </w:p>
+        </w:tc>
+        <w:tc>
+          <w:tcPr>
+            <w:tcW w:w="5506" w:type="dxa"/>
+            <w:shd w:val="clear" w:color="auto" w:fill="1B1620"/>
+            <w:tcMar>
+              <w:top w:w="40" w:type="dxa"/>
+              <w:left w:w="90" w:type="dxa"/>
+              <w:bottom w:w="40" w:type="dxa"/>
+              <w:right w:w="90" w:type="dxa"/>
+            </w:tcMar>
+            <w:vAlign w:val="center"/>
+          </w:tcPr>
+          <w:p>
+            <w:pPr>
+              <w:spacing w:before="28" w:after="28" w:line="215" w:lineRule="auto"/>
+            </w:pPr>
+            <w:r>
+              <w:rPr>
+                <w:rFonts w:ascii="Consolas" w:eastAsia="Consolas" w:hAnsi="Consolas" w:cs="Consolas"/>
+                <w:b/>
+                <w:bCs/>
+                <w:color w:val="FFFFFF"/>
+                <w:sz w:val="14"/>
+                <w:szCs w:val="14"/>
+              </w:rPr>
               <w:t>COMPORTAMENTO</w:t>
             </w:r>
           </w:p>
@@ -3545,7 +3690,21 @@
                 <w:sz w:val="15"/>
                 <w:szCs w:val="15"/>
               </w:rPr>
-              <w:t>Carga do lampião. Cada bateria = 60 s de luz contínua. A barra só drena com o lampião ligado.</w:t>
+              <w:t>Carga do lampião. Cada bateria = 60 s de luz contínua. A barra só drena com o lampião ligado</w:t>
+            </w:r>
+            <w:r>
+              <w:rPr>
+                <w:sz w:val="15"/>
+                <w:szCs w:val="15"/>
+              </w:rPr>
+              <w:t>, sendo que de 15 em 15 segundos, uma barra da bateria some</w:t>
+            </w:r>
+            <w:r>
+              <w:rPr>
+                <w:sz w:val="15"/>
+                <w:szCs w:val="15"/>
+              </w:rPr>
+              <w:t>.</w:t>
             </w:r>
           </w:p>
         </w:tc>
@@ -3993,6 +4152,210 @@
           </w:p>
         </w:tc>
       </w:tr>
+      <w:tr>
+        <w:tc>
+          <w:tcPr>
+            <w:tcW w:w="1500" w:type="dxa"/>
+            <w:shd w:val="clear" w:color="auto" w:fill="FFFFFF"/>
+            <w:tcMar>
+              <w:top w:w="40" w:type="dxa"/>
+              <w:left w:w="90" w:type="dxa"/>
+              <w:bottom w:w="40" w:type="dxa"/>
+              <w:right w:w="90" w:type="dxa"/>
+            </w:tcMar>
+            <w:vAlign w:val="center"/>
+          </w:tcPr>
+          <w:p>
+            <w:pPr>
+              <w:spacing w:before="28" w:after="28" w:line="215" w:lineRule="auto"/>
+              <w:rPr>
+                <w:rFonts w:ascii="Consolas" w:eastAsia="Consolas" w:hAnsi="Consolas" w:cs="Consolas"/>
+                <w:b/>
+                <w:bCs/>
+                <w:sz w:val="15"/>
+                <w:szCs w:val="15"/>
+              </w:rPr>
+            </w:pPr>
+            <w:r>
+              <w:rPr>
+                <w:rFonts w:ascii="Consolas" w:eastAsia="Consolas" w:hAnsi="Consolas" w:cs="Consolas"/>
+                <w:b/>
+                <w:bCs/>
+                <w:sz w:val="15"/>
+                <w:szCs w:val="15"/>
+              </w:rPr>
+              <w:t>CTRL</w:t>
+            </w:r>
+          </w:p>
+        </w:tc>
+        <w:tc>
+          <w:tcPr>
+            <w:tcW w:w="2300" w:type="dxa"/>
+            <w:shd w:val="clear" w:color="auto" w:fill="FFFFFF"/>
+            <w:tcMar>
+              <w:top w:w="40" w:type="dxa"/>
+              <w:left w:w="90" w:type="dxa"/>
+              <w:bottom w:w="40" w:type="dxa"/>
+              <w:right w:w="90" w:type="dxa"/>
+            </w:tcMar>
+            <w:vAlign w:val="center"/>
+          </w:tcPr>
+          <w:p>
+            <w:pPr>
+              <w:spacing w:before="28" w:after="28" w:line="215" w:lineRule="auto"/>
+              <w:rPr>
+                <w:sz w:val="15"/>
+                <w:szCs w:val="15"/>
+              </w:rPr>
+            </w:pPr>
+            <w:r>
+              <w:rPr>
+                <w:sz w:val="15"/>
+                <w:szCs w:val="15"/>
+              </w:rPr>
+              <w:t>Agacha/levanta</w:t>
+            </w:r>
+          </w:p>
+        </w:tc>
+        <w:tc>
+          <w:tcPr>
+            <w:tcW w:w="6106" w:type="dxa"/>
+            <w:shd w:val="clear" w:color="auto" w:fill="FFFFFF"/>
+            <w:tcMar>
+              <w:top w:w="40" w:type="dxa"/>
+              <w:left w:w="90" w:type="dxa"/>
+              <w:bottom w:w="40" w:type="dxa"/>
+              <w:right w:w="90" w:type="dxa"/>
+            </w:tcMar>
+            <w:vAlign w:val="center"/>
+          </w:tcPr>
+          <w:p>
+            <w:pPr>
+              <w:spacing w:before="28" w:after="28" w:line="215" w:lineRule="auto"/>
+              <w:rPr>
+                <w:sz w:val="15"/>
+                <w:szCs w:val="15"/>
+              </w:rPr>
+            </w:pPr>
+            <w:r>
+              <w:rPr>
+                <w:sz w:val="15"/>
+                <w:szCs w:val="15"/>
+              </w:rPr>
+              <w:t>Alterna entr</w:t>
+            </w:r>
+            <w:r>
+              <w:rPr>
+                <w:sz w:val="15"/>
+                <w:szCs w:val="15"/>
+              </w:rPr>
+              <w:t>e</w:t>
+            </w:r>
+            <w:r>
+              <w:rPr>
+                <w:sz w:val="15"/>
+                <w:szCs w:val="15"/>
+              </w:rPr>
+              <w:t xml:space="preserve"> a posição da personagem</w:t>
+            </w:r>
+          </w:p>
+        </w:tc>
+      </w:tr>
+      <w:tr>
+        <w:tc>
+          <w:tcPr>
+            <w:tcW w:w="1500" w:type="dxa"/>
+            <w:shd w:val="clear" w:color="auto" w:fill="FFFFFF"/>
+            <w:tcMar>
+              <w:top w:w="40" w:type="dxa"/>
+              <w:left w:w="90" w:type="dxa"/>
+              <w:bottom w:w="40" w:type="dxa"/>
+              <w:right w:w="90" w:type="dxa"/>
+            </w:tcMar>
+            <w:vAlign w:val="center"/>
+          </w:tcPr>
+          <w:p>
+            <w:pPr>
+              <w:spacing w:before="28" w:after="28" w:line="215" w:lineRule="auto"/>
+              <w:rPr>
+                <w:rFonts w:ascii="Consolas" w:eastAsia="Consolas" w:hAnsi="Consolas" w:cs="Consolas"/>
+                <w:b/>
+                <w:bCs/>
+                <w:sz w:val="15"/>
+                <w:szCs w:val="15"/>
+              </w:rPr>
+            </w:pPr>
+            <w:r>
+              <w:rPr>
+                <w:rFonts w:ascii="Consolas" w:eastAsia="Consolas" w:hAnsi="Consolas" w:cs="Consolas"/>
+                <w:b/>
+                <w:bCs/>
+                <w:sz w:val="15"/>
+                <w:szCs w:val="15"/>
+              </w:rPr>
+              <w:t>ESC</w:t>
+            </w:r>
+          </w:p>
+        </w:tc>
+        <w:tc>
+          <w:tcPr>
+            <w:tcW w:w="2300" w:type="dxa"/>
+            <w:shd w:val="clear" w:color="auto" w:fill="FFFFFF"/>
+            <w:tcMar>
+              <w:top w:w="40" w:type="dxa"/>
+              <w:left w:w="90" w:type="dxa"/>
+              <w:bottom w:w="40" w:type="dxa"/>
+              <w:right w:w="90" w:type="dxa"/>
+            </w:tcMar>
+            <w:vAlign w:val="center"/>
+          </w:tcPr>
+          <w:p>
+            <w:pPr>
+              <w:spacing w:before="28" w:after="28" w:line="215" w:lineRule="auto"/>
+              <w:rPr>
+                <w:sz w:val="15"/>
+                <w:szCs w:val="15"/>
+              </w:rPr>
+            </w:pPr>
+            <w:r>
+              <w:rPr>
+                <w:sz w:val="15"/>
+                <w:szCs w:val="15"/>
+              </w:rPr>
+              <w:t>Abrir/fechar menu</w:t>
+            </w:r>
+          </w:p>
+        </w:tc>
+        <w:tc>
+          <w:tcPr>
+            <w:tcW w:w="6106" w:type="dxa"/>
+            <w:shd w:val="clear" w:color="auto" w:fill="FFFFFF"/>
+            <w:tcMar>
+              <w:top w:w="40" w:type="dxa"/>
+              <w:left w:w="90" w:type="dxa"/>
+              <w:bottom w:w="40" w:type="dxa"/>
+              <w:right w:w="90" w:type="dxa"/>
+            </w:tcMar>
+            <w:vAlign w:val="center"/>
+          </w:tcPr>
+          <w:p>
+            <w:pPr>
+              <w:spacing w:before="28" w:after="28" w:line="215" w:lineRule="auto"/>
+              <w:rPr>
+                <w:sz w:val="15"/>
+                <w:szCs w:val="15"/>
+              </w:rPr>
+            </w:pPr>
+            <w:r>
+              <w:rPr>
+                <w:sz w:val="15"/>
+                <w:szCs w:val="15"/>
+              </w:rPr>
+              <w:t>Alterna entre o menu principal e o jogo</w:t>
+            </w:r>
+          </w:p>
+        </w:tc>
+      </w:tr>
     </w:tbl>
     <w:p>
       <w:pPr>
@@ -4095,6 +4458,122 @@
               </w:rPr>
               <w:t>Vitória: reunir as 8 fatias e entrar na casa da avó.  ·  Derrota: perder os 3 corações.</w:t>
             </w:r>
+          </w:p>
+        </w:tc>
+      </w:tr>
+    </w:tbl>
+    <w:p/>
+    <w:tbl>
+      <w:tblPr>
+        <w:tblW w:w="9906" w:type="dxa"/>
+        <w:tblBorders>
+          <w:top w:val="single" w:sz="2" w:space="0" w:color="E4D2D2"/>
+          <w:left w:val="single" w:sz="12" w:space="0" w:color="8E1418"/>
+          <w:bottom w:val="single" w:sz="2" w:space="0" w:color="E4D2D2"/>
+          <w:right w:val="single" w:sz="2" w:space="0" w:color="E4D2D2"/>
+          <w:insideH w:val="none" w:sz="0" w:space="0" w:color="FFFFFF"/>
+          <w:insideV w:val="none" w:sz="0" w:space="0" w:color="FFFFFF"/>
+        </w:tblBorders>
+        <w:tblCellMar>
+          <w:left w:w="10" w:type="dxa"/>
+          <w:right w:w="10" w:type="dxa"/>
+        </w:tblCellMar>
+        <w:tblLook w:val="0000" w:firstRow="0" w:lastRow="0" w:firstColumn="0" w:lastColumn="0" w:noHBand="0" w:noVBand="0"/>
+      </w:tblPr>
+      <w:tblGrid>
+        <w:gridCol w:w="9906"/>
+      </w:tblGrid>
+      <w:tr>
+        <w:tc>
+          <w:tcPr>
+            <w:tcW w:w="9906" w:type="dxa"/>
+            <w:shd w:val="clear" w:color="auto" w:fill="F7ECEC"/>
+            <w:tcMar>
+              <w:top w:w="90" w:type="dxa"/>
+              <w:left w:w="160" w:type="dxa"/>
+              <w:bottom w:w="90" w:type="dxa"/>
+              <w:right w:w="140" w:type="dxa"/>
+            </w:tcMar>
+          </w:tcPr>
+          <w:p>
+            <w:pPr>
+              <w:spacing w:after="40"/>
+            </w:pPr>
+            <w:r>
+              <w:rPr>
+                <w:rFonts w:ascii="Consolas" w:eastAsia="Consolas" w:hAnsi="Consolas" w:cs="Consolas"/>
+                <w:b/>
+                <w:bCs/>
+                <w:color w:val="8E1418"/>
+                <w:spacing w:val="16"/>
+                <w:sz w:val="15"/>
+                <w:szCs w:val="15"/>
+              </w:rPr>
+              <w:t xml:space="preserve">REGRAS DO </w:t>
+            </w:r>
+            <w:r>
+              <w:rPr>
+                <w:rFonts w:ascii="Consolas" w:eastAsia="Consolas" w:hAnsi="Consolas" w:cs="Consolas"/>
+                <w:b/>
+                <w:bCs/>
+                <w:color w:val="8E1418"/>
+                <w:spacing w:val="16"/>
+                <w:sz w:val="15"/>
+                <w:szCs w:val="15"/>
+              </w:rPr>
+              <w:t>AGACHAR</w:t>
+            </w:r>
+          </w:p>
+          <w:p>
+            <w:pPr>
+              <w:spacing w:after="24" w:line="220" w:lineRule="auto"/>
+              <w:rPr>
+                <w:sz w:val="16"/>
+                <w:szCs w:val="16"/>
+              </w:rPr>
+            </w:pPr>
+            <w:r>
+              <w:rPr>
+                <w:sz w:val="16"/>
+                <w:szCs w:val="16"/>
+              </w:rPr>
+              <w:t xml:space="preserve">Muda a posição atual do personagem, quando nesta posição, o lobo não a percebe. </w:t>
+            </w:r>
+          </w:p>
+          <w:p>
+            <w:pPr>
+              <w:spacing w:after="24" w:line="220" w:lineRule="auto"/>
+              <w:rPr>
+                <w:sz w:val="16"/>
+                <w:szCs w:val="16"/>
+              </w:rPr>
+            </w:pPr>
+            <w:r>
+              <w:rPr>
+                <w:sz w:val="16"/>
+                <w:szCs w:val="16"/>
+              </w:rPr>
+              <w:t xml:space="preserve">É a única forma de despistar o lobo após a </w:t>
+            </w:r>
+            <w:r>
+              <w:rPr>
+                <w:sz w:val="16"/>
+                <w:szCs w:val="16"/>
+              </w:rPr>
+              <w:t>7ª fatia</w:t>
+            </w:r>
+            <w:r>
+              <w:rPr>
+                <w:sz w:val="16"/>
+                <w:szCs w:val="16"/>
+              </w:rPr>
+              <w:t>.</w:t>
+            </w:r>
+          </w:p>
+          <w:p>
+            <w:pPr>
+              <w:spacing w:after="24" w:line="220" w:lineRule="auto"/>
+            </w:pPr>
           </w:p>
         </w:tc>
       </w:tr>

</xml_diff>